<commit_message>
TOC: main sections only, fixed column alignment
- Removed subsection entries from TOC (main sections only)
- Fixed column widths (num 0.5", title 4.5", dots 1.5") to eliminate gaps
- Consistent spacing and font size across all TOC rows

https://claude.ai/code/session_016bAVLz9TDFvTo7m6M6ouEi
</commit_message>
<xml_diff>
--- a/WMS_Full_WMS_Proposal.docx
+++ b/WMS_Full_WMS_Proposal.docx
@@ -450,6 +450,11 @@
       </w:pPr>
     </w:p>
     <w:tbl>
+      <w:tblGrid>
+        <w:gridCol w:w="720"/>
+        <w:gridCol w:w="6480"/>
+        <w:gridCol w:w="2160"/>
+      </w:tblGrid>
       <w:tblPr>
         <w:tblStyle w:val="TableGrid"/>
         <w:tblW w:type="auto" w:w="0"/>
@@ -472,10 +477,11 @@
         <w:tc>
           <w:tcPr>
             <w:tcW w:type="dxa" w:w="3079"/>
-          </w:tcPr>
-          <w:p>
-            <w:pPr>
-              <w:spacing w:before="100" w:after="40"/>
+            <w:tcW w:w="720" w:type="dxa"/>
+          </w:tcPr>
+          <w:p>
+            <w:pPr>
+              <w:spacing w:before="80" w:after="80"/>
             </w:pPr>
             <w:r>
               <w:rPr>
@@ -490,11 +496,11 @@
         <w:tc>
           <w:tcPr>
             <w:tcW w:type="dxa" w:w="3079"/>
-          </w:tcPr>
-          <w:p>
-            <w:pPr>
-              <w:spacing w:before="100" w:after="40"/>
-              <w:ind w:left="0"/>
+            <w:tcW w:w="6480" w:type="dxa"/>
+          </w:tcPr>
+          <w:p>
+            <w:pPr>
+              <w:spacing w:before="80" w:after="80"/>
             </w:pPr>
             <w:r>
               <w:rPr>
@@ -509,18 +515,19 @@
         <w:tc>
           <w:tcPr>
             <w:tcW w:type="dxa" w:w="3079"/>
-          </w:tcPr>
-          <w:p>
-            <w:pPr>
-              <w:spacing w:before="100"/>
+            <w:tcW w:w="2160" w:type="dxa"/>
+          </w:tcPr>
+          <w:p>
+            <w:pPr>
+              <w:spacing w:before="80" w:after="80"/>
               <w:jc w:val="right"/>
             </w:pPr>
             <w:r>
               <w:rPr>
                 <w:color w:val="CCCCCC"/>
-                <w:sz w:val="16"/>
-              </w:rPr>
-              <w:t>·············································</w:t>
+                <w:sz w:val="18"/>
+              </w:rPr>
+              <w:t>······························</w:t>
             </w:r>
           </w:p>
         </w:tc>
@@ -529,10 +536,11 @@
         <w:tc>
           <w:tcPr>
             <w:tcW w:type="dxa" w:w="3079"/>
-          </w:tcPr>
-          <w:p>
-            <w:pPr>
-              <w:spacing w:before="100" w:after="40"/>
+            <w:tcW w:w="720" w:type="dxa"/>
+          </w:tcPr>
+          <w:p>
+            <w:pPr>
+              <w:spacing w:before="80" w:after="80"/>
             </w:pPr>
             <w:r>
               <w:rPr>
@@ -547,11 +555,11 @@
         <w:tc>
           <w:tcPr>
             <w:tcW w:type="dxa" w:w="3079"/>
-          </w:tcPr>
-          <w:p>
-            <w:pPr>
-              <w:spacing w:before="100" w:after="40"/>
-              <w:ind w:left="0"/>
+            <w:tcW w:w="6480" w:type="dxa"/>
+          </w:tcPr>
+          <w:p>
+            <w:pPr>
+              <w:spacing w:before="80" w:after="80"/>
             </w:pPr>
             <w:r>
               <w:rPr>
@@ -566,18 +574,19 @@
         <w:tc>
           <w:tcPr>
             <w:tcW w:type="dxa" w:w="3079"/>
-          </w:tcPr>
-          <w:p>
-            <w:pPr>
-              <w:spacing w:before="100"/>
+            <w:tcW w:w="2160" w:type="dxa"/>
+          </w:tcPr>
+          <w:p>
+            <w:pPr>
+              <w:spacing w:before="80" w:after="80"/>
               <w:jc w:val="right"/>
             </w:pPr>
             <w:r>
               <w:rPr>
                 <w:color w:val="CCCCCC"/>
-                <w:sz w:val="16"/>
-              </w:rPr>
-              <w:t>·············································</w:t>
+                <w:sz w:val="18"/>
+              </w:rPr>
+              <w:t>······························</w:t>
             </w:r>
           </w:p>
         </w:tc>
@@ -586,108 +595,11 @@
         <w:tc>
           <w:tcPr>
             <w:tcW w:type="dxa" w:w="3079"/>
-          </w:tcPr>
-          <w:p>
-            <w:pPr>
-              <w:spacing w:before="40" w:after="40"/>
-            </w:pPr>
-          </w:p>
-        </w:tc>
-        <w:tc>
-          <w:tcPr>
-            <w:tcW w:type="dxa" w:w="3079"/>
-          </w:tcPr>
-          <w:p>
-            <w:pPr>
-              <w:spacing w:before="40" w:after="40"/>
-              <w:ind w:left="360"/>
-            </w:pPr>
-            <w:r>
-              <w:rPr>
-                <w:b w:val="0"/>
-                <w:color w:val="64748B"/>
-                <w:sz w:val="20"/>
-              </w:rPr>
-              <w:t>2.1  Architecture Layers</w:t>
-            </w:r>
-          </w:p>
-        </w:tc>
-        <w:tc>
-          <w:tcPr>
-            <w:tcW w:type="dxa" w:w="3079"/>
-          </w:tcPr>
-          <w:p>
-            <w:pPr>
-              <w:spacing w:before="40"/>
-              <w:jc w:val="right"/>
-            </w:pPr>
-            <w:r>
-              <w:rPr>
-                <w:color w:val="CCCCCC"/>
-                <w:sz w:val="16"/>
-              </w:rPr>
-              <w:t>········································</w:t>
-            </w:r>
-          </w:p>
-        </w:tc>
-      </w:tr>
-      <w:tr>
-        <w:tc>
-          <w:tcPr>
-            <w:tcW w:type="dxa" w:w="3079"/>
-          </w:tcPr>
-          <w:p>
-            <w:pPr>
-              <w:spacing w:before="40" w:after="40"/>
-            </w:pPr>
-          </w:p>
-        </w:tc>
-        <w:tc>
-          <w:tcPr>
-            <w:tcW w:type="dxa" w:w="3079"/>
-          </w:tcPr>
-          <w:p>
-            <w:pPr>
-              <w:spacing w:before="40" w:after="40"/>
-              <w:ind w:left="360"/>
-            </w:pPr>
-            <w:r>
-              <w:rPr>
-                <w:b w:val="0"/>
-                <w:color w:val="64748B"/>
-                <w:sz w:val="20"/>
-              </w:rPr>
-              <w:t>2.2  Data Flow Principle</w:t>
-            </w:r>
-          </w:p>
-        </w:tc>
-        <w:tc>
-          <w:tcPr>
-            <w:tcW w:type="dxa" w:w="3079"/>
-          </w:tcPr>
-          <w:p>
-            <w:pPr>
-              <w:spacing w:before="40"/>
-              <w:jc w:val="right"/>
-            </w:pPr>
-            <w:r>
-              <w:rPr>
-                <w:color w:val="CCCCCC"/>
-                <w:sz w:val="16"/>
-              </w:rPr>
-              <w:t>········································</w:t>
-            </w:r>
-          </w:p>
-        </w:tc>
-      </w:tr>
-      <w:tr>
-        <w:tc>
-          <w:tcPr>
-            <w:tcW w:type="dxa" w:w="3079"/>
-          </w:tcPr>
-          <w:p>
-            <w:pPr>
-              <w:spacing w:before="100" w:after="40"/>
+            <w:tcW w:w="720" w:type="dxa"/>
+          </w:tcPr>
+          <w:p>
+            <w:pPr>
+              <w:spacing w:before="80" w:after="80"/>
             </w:pPr>
             <w:r>
               <w:rPr>
@@ -702,11 +614,11 @@
         <w:tc>
           <w:tcPr>
             <w:tcW w:type="dxa" w:w="3079"/>
-          </w:tcPr>
-          <w:p>
-            <w:pPr>
-              <w:spacing w:before="100" w:after="40"/>
-              <w:ind w:left="0"/>
+            <w:tcW w:w="6480" w:type="dxa"/>
+          </w:tcPr>
+          <w:p>
+            <w:pPr>
+              <w:spacing w:before="80" w:after="80"/>
             </w:pPr>
             <w:r>
               <w:rPr>
@@ -721,18 +633,19 @@
         <w:tc>
           <w:tcPr>
             <w:tcW w:type="dxa" w:w="3079"/>
-          </w:tcPr>
-          <w:p>
-            <w:pPr>
-              <w:spacing w:before="100"/>
+            <w:tcW w:w="2160" w:type="dxa"/>
+          </w:tcPr>
+          <w:p>
+            <w:pPr>
+              <w:spacing w:before="80" w:after="80"/>
               <w:jc w:val="right"/>
             </w:pPr>
             <w:r>
               <w:rPr>
                 <w:color w:val="CCCCCC"/>
-                <w:sz w:val="16"/>
-              </w:rPr>
-              <w:t>·············································</w:t>
+                <w:sz w:val="18"/>
+              </w:rPr>
+              <w:t>······························</w:t>
             </w:r>
           </w:p>
         </w:tc>
@@ -741,402 +654,11 @@
         <w:tc>
           <w:tcPr>
             <w:tcW w:type="dxa" w:w="3079"/>
-          </w:tcPr>
-          <w:p>
-            <w:pPr>
-              <w:spacing w:before="40" w:after="40"/>
-            </w:pPr>
-          </w:p>
-        </w:tc>
-        <w:tc>
-          <w:tcPr>
-            <w:tcW w:type="dxa" w:w="3079"/>
-          </w:tcPr>
-          <w:p>
-            <w:pPr>
-              <w:spacing w:before="40" w:after="40"/>
-              <w:ind w:left="360"/>
-            </w:pPr>
-            <w:r>
-              <w:rPr>
-                <w:b w:val="0"/>
-                <w:color w:val="64748B"/>
-                <w:sz w:val="20"/>
-              </w:rPr>
-              <w:t>Step 1  Define Inventory Organisation Structure</w:t>
-            </w:r>
-          </w:p>
-        </w:tc>
-        <w:tc>
-          <w:tcPr>
-            <w:tcW w:type="dxa" w:w="3079"/>
-          </w:tcPr>
-          <w:p>
-            <w:pPr>
-              <w:spacing w:before="40"/>
-              <w:jc w:val="right"/>
-            </w:pPr>
-            <w:r>
-              <w:rPr>
-                <w:color w:val="CCCCCC"/>
-                <w:sz w:val="16"/>
-              </w:rPr>
-              <w:t>········································</w:t>
-            </w:r>
-          </w:p>
-        </w:tc>
-      </w:tr>
-      <w:tr>
-        <w:tc>
-          <w:tcPr>
-            <w:tcW w:type="dxa" w:w="3079"/>
-          </w:tcPr>
-          <w:p>
-            <w:pPr>
-              <w:spacing w:before="40" w:after="40"/>
-            </w:pPr>
-          </w:p>
-        </w:tc>
-        <w:tc>
-          <w:tcPr>
-            <w:tcW w:type="dxa" w:w="3079"/>
-          </w:tcPr>
-          <w:p>
-            <w:pPr>
-              <w:spacing w:before="40" w:after="40"/>
-              <w:ind w:left="360"/>
-            </w:pPr>
-            <w:r>
-              <w:rPr>
-                <w:b w:val="0"/>
-                <w:color w:val="64748B"/>
-                <w:sz w:val="20"/>
-              </w:rPr>
-              <w:t>Step 2  Define Physical Locator Structure in Fusion</w:t>
-            </w:r>
-          </w:p>
-        </w:tc>
-        <w:tc>
-          <w:tcPr>
-            <w:tcW w:type="dxa" w:w="3079"/>
-          </w:tcPr>
-          <w:p>
-            <w:pPr>
-              <w:spacing w:before="40"/>
-              <w:jc w:val="right"/>
-            </w:pPr>
-            <w:r>
-              <w:rPr>
-                <w:color w:val="CCCCCC"/>
-                <w:sz w:val="16"/>
-              </w:rPr>
-              <w:t>········································</w:t>
-            </w:r>
-          </w:p>
-        </w:tc>
-      </w:tr>
-      <w:tr>
-        <w:tc>
-          <w:tcPr>
-            <w:tcW w:type="dxa" w:w="3079"/>
-          </w:tcPr>
-          <w:p>
-            <w:pPr>
-              <w:spacing w:before="40" w:after="40"/>
-            </w:pPr>
-          </w:p>
-        </w:tc>
-        <w:tc>
-          <w:tcPr>
-            <w:tcW w:type="dxa" w:w="3079"/>
-          </w:tcPr>
-          <w:p>
-            <w:pPr>
-              <w:spacing w:before="40" w:after="40"/>
-              <w:ind w:left="360"/>
-            </w:pPr>
-            <w:r>
-              <w:rPr>
-                <w:b w:val="0"/>
-                <w:color w:val="64748B"/>
-                <w:sz w:val="20"/>
-              </w:rPr>
-              <w:t>Step 3  Enable Locator Control on each Subinventory</w:t>
-            </w:r>
-          </w:p>
-        </w:tc>
-        <w:tc>
-          <w:tcPr>
-            <w:tcW w:type="dxa" w:w="3079"/>
-          </w:tcPr>
-          <w:p>
-            <w:pPr>
-              <w:spacing w:before="40"/>
-              <w:jc w:val="right"/>
-            </w:pPr>
-            <w:r>
-              <w:rPr>
-                <w:color w:val="CCCCCC"/>
-                <w:sz w:val="16"/>
-              </w:rPr>
-              <w:t>········································</w:t>
-            </w:r>
-          </w:p>
-        </w:tc>
-      </w:tr>
-      <w:tr>
-        <w:tc>
-          <w:tcPr>
-            <w:tcW w:type="dxa" w:w="3079"/>
-          </w:tcPr>
-          <w:p>
-            <w:pPr>
-              <w:spacing w:before="40" w:after="40"/>
-            </w:pPr>
-          </w:p>
-        </w:tc>
-        <w:tc>
-          <w:tcPr>
-            <w:tcW w:type="dxa" w:w="3079"/>
-          </w:tcPr>
-          <w:p>
-            <w:pPr>
-              <w:spacing w:before="40" w:after="40"/>
-              <w:ind w:left="360"/>
-            </w:pPr>
-            <w:r>
-              <w:rPr>
-                <w:b w:val="0"/>
-                <w:color w:val="64748B"/>
-                <w:sz w:val="20"/>
-              </w:rPr>
-              <w:t>Step 4  Stock Migration to Locators (Cut-Over Activity)</w:t>
-            </w:r>
-          </w:p>
-        </w:tc>
-        <w:tc>
-          <w:tcPr>
-            <w:tcW w:type="dxa" w:w="3079"/>
-          </w:tcPr>
-          <w:p>
-            <w:pPr>
-              <w:spacing w:before="40"/>
-              <w:jc w:val="right"/>
-            </w:pPr>
-            <w:r>
-              <w:rPr>
-                <w:color w:val="CCCCCC"/>
-                <w:sz w:val="16"/>
-              </w:rPr>
-              <w:t>········································</w:t>
-            </w:r>
-          </w:p>
-        </w:tc>
-      </w:tr>
-      <w:tr>
-        <w:tc>
-          <w:tcPr>
-            <w:tcW w:type="dxa" w:w="3079"/>
-          </w:tcPr>
-          <w:p>
-            <w:pPr>
-              <w:spacing w:before="40" w:after="40"/>
-            </w:pPr>
-          </w:p>
-        </w:tc>
-        <w:tc>
-          <w:tcPr>
-            <w:tcW w:type="dxa" w:w="3079"/>
-          </w:tcPr>
-          <w:p>
-            <w:pPr>
-              <w:spacing w:before="40" w:after="40"/>
-              <w:ind w:left="360"/>
-            </w:pPr>
-            <w:r>
-              <w:rPr>
-                <w:b w:val="0"/>
-                <w:color w:val="64748B"/>
-                <w:sz w:val="20"/>
-              </w:rPr>
-              <w:t>Step 5  Configure Putaway Rules in Fusion</w:t>
-            </w:r>
-          </w:p>
-        </w:tc>
-        <w:tc>
-          <w:tcPr>
-            <w:tcW w:type="dxa" w:w="3079"/>
-          </w:tcPr>
-          <w:p>
-            <w:pPr>
-              <w:spacing w:before="40"/>
-              <w:jc w:val="right"/>
-            </w:pPr>
-            <w:r>
-              <w:rPr>
-                <w:color w:val="CCCCCC"/>
-                <w:sz w:val="16"/>
-              </w:rPr>
-              <w:t>········································</w:t>
-            </w:r>
-          </w:p>
-        </w:tc>
-      </w:tr>
-      <w:tr>
-        <w:tc>
-          <w:tcPr>
-            <w:tcW w:type="dxa" w:w="3079"/>
-          </w:tcPr>
-          <w:p>
-            <w:pPr>
-              <w:spacing w:before="40" w:after="40"/>
-            </w:pPr>
-          </w:p>
-        </w:tc>
-        <w:tc>
-          <w:tcPr>
-            <w:tcW w:type="dxa" w:w="3079"/>
-          </w:tcPr>
-          <w:p>
-            <w:pPr>
-              <w:spacing w:before="40" w:after="40"/>
-              <w:ind w:left="360"/>
-            </w:pPr>
-            <w:r>
-              <w:rPr>
-                <w:b w:val="0"/>
-                <w:color w:val="64748B"/>
-                <w:sz w:val="20"/>
-              </w:rPr>
-              <w:t>Step 6  Configure Cycle Counting in Fusion</w:t>
-            </w:r>
-          </w:p>
-        </w:tc>
-        <w:tc>
-          <w:tcPr>
-            <w:tcW w:type="dxa" w:w="3079"/>
-          </w:tcPr>
-          <w:p>
-            <w:pPr>
-              <w:spacing w:before="40"/>
-              <w:jc w:val="right"/>
-            </w:pPr>
-            <w:r>
-              <w:rPr>
-                <w:color w:val="CCCCCC"/>
-                <w:sz w:val="16"/>
-              </w:rPr>
-              <w:t>········································</w:t>
-            </w:r>
-          </w:p>
-        </w:tc>
-      </w:tr>
-      <w:tr>
-        <w:tc>
-          <w:tcPr>
-            <w:tcW w:type="dxa" w:w="3079"/>
-          </w:tcPr>
-          <w:p>
-            <w:pPr>
-              <w:spacing w:before="40" w:after="40"/>
-            </w:pPr>
-          </w:p>
-        </w:tc>
-        <w:tc>
-          <w:tcPr>
-            <w:tcW w:type="dxa" w:w="3079"/>
-          </w:tcPr>
-          <w:p>
-            <w:pPr>
-              <w:spacing w:before="40" w:after="40"/>
-              <w:ind w:left="360"/>
-            </w:pPr>
-            <w:r>
-              <w:rPr>
-                <w:b w:val="0"/>
-                <w:color w:val="64748B"/>
-                <w:sz w:val="20"/>
-              </w:rPr>
-              <w:t>Step 7  REST API &amp; Security Setup</w:t>
-            </w:r>
-          </w:p>
-        </w:tc>
-        <w:tc>
-          <w:tcPr>
-            <w:tcW w:type="dxa" w:w="3079"/>
-          </w:tcPr>
-          <w:p>
-            <w:pPr>
-              <w:spacing w:before="40"/>
-              <w:jc w:val="right"/>
-            </w:pPr>
-            <w:r>
-              <w:rPr>
-                <w:color w:val="CCCCCC"/>
-                <w:sz w:val="16"/>
-              </w:rPr>
-              <w:t>········································</w:t>
-            </w:r>
-          </w:p>
-        </w:tc>
-      </w:tr>
-      <w:tr>
-        <w:tc>
-          <w:tcPr>
-            <w:tcW w:type="dxa" w:w="3079"/>
-          </w:tcPr>
-          <w:p>
-            <w:pPr>
-              <w:spacing w:before="40" w:after="40"/>
-            </w:pPr>
-          </w:p>
-        </w:tc>
-        <w:tc>
-          <w:tcPr>
-            <w:tcW w:type="dxa" w:w="3079"/>
-          </w:tcPr>
-          <w:p>
-            <w:pPr>
-              <w:spacing w:before="40" w:after="40"/>
-              <w:ind w:left="360"/>
-            </w:pPr>
-            <w:r>
-              <w:rPr>
-                <w:b w:val="0"/>
-                <w:color w:val="64748B"/>
-                <w:sz w:val="20"/>
-              </w:rPr>
-              <w:t>Fusion Locator Setup Summary Checklist</w:t>
-            </w:r>
-          </w:p>
-        </w:tc>
-        <w:tc>
-          <w:tcPr>
-            <w:tcW w:type="dxa" w:w="3079"/>
-          </w:tcPr>
-          <w:p>
-            <w:pPr>
-              <w:spacing w:before="40"/>
-              <w:jc w:val="right"/>
-            </w:pPr>
-            <w:r>
-              <w:rPr>
-                <w:color w:val="CCCCCC"/>
-                <w:sz w:val="16"/>
-              </w:rPr>
-              <w:t>········································</w:t>
-            </w:r>
-          </w:p>
-        </w:tc>
-      </w:tr>
-      <w:tr>
-        <w:tc>
-          <w:tcPr>
-            <w:tcW w:type="dxa" w:w="3079"/>
-          </w:tcPr>
-          <w:p>
-            <w:pPr>
-              <w:spacing w:before="100" w:after="40"/>
+            <w:tcW w:w="720" w:type="dxa"/>
+          </w:tcPr>
+          <w:p>
+            <w:pPr>
+              <w:spacing w:before="80" w:after="80"/>
             </w:pPr>
             <w:r>
               <w:rPr>
@@ -1151,11 +673,11 @@
         <w:tc>
           <w:tcPr>
             <w:tcW w:type="dxa" w:w="3079"/>
-          </w:tcPr>
-          <w:p>
-            <w:pPr>
-              <w:spacing w:before="100" w:after="40"/>
-              <w:ind w:left="0"/>
+            <w:tcW w:w="6480" w:type="dxa"/>
+          </w:tcPr>
+          <w:p>
+            <w:pPr>
+              <w:spacing w:before="80" w:after="80"/>
             </w:pPr>
             <w:r>
               <w:rPr>
@@ -1170,18 +692,19 @@
         <w:tc>
           <w:tcPr>
             <w:tcW w:type="dxa" w:w="3079"/>
-          </w:tcPr>
-          <w:p>
-            <w:pPr>
-              <w:spacing w:before="100"/>
+            <w:tcW w:w="2160" w:type="dxa"/>
+          </w:tcPr>
+          <w:p>
+            <w:pPr>
+              <w:spacing w:before="80" w:after="80"/>
               <w:jc w:val="right"/>
             </w:pPr>
             <w:r>
               <w:rPr>
                 <w:color w:val="CCCCCC"/>
-                <w:sz w:val="16"/>
-              </w:rPr>
-              <w:t>·············································</w:t>
+                <w:sz w:val="18"/>
+              </w:rPr>
+              <w:t>······························</w:t>
             </w:r>
           </w:p>
         </w:tc>
@@ -1190,206 +713,11 @@
         <w:tc>
           <w:tcPr>
             <w:tcW w:type="dxa" w:w="3079"/>
-          </w:tcPr>
-          <w:p>
-            <w:pPr>
-              <w:spacing w:before="40" w:after="40"/>
-            </w:pPr>
-          </w:p>
-        </w:tc>
-        <w:tc>
-          <w:tcPr>
-            <w:tcW w:type="dxa" w:w="3079"/>
-          </w:tcPr>
-          <w:p>
-            <w:pPr>
-              <w:spacing w:before="40" w:after="40"/>
-              <w:ind w:left="360"/>
-            </w:pPr>
-            <w:r>
-              <w:rPr>
-                <w:b w:val="0"/>
-                <w:color w:val="64748B"/>
-                <w:sz w:val="20"/>
-              </w:rPr>
-              <w:t>4.1  Stock Issues  (Sales Order / Misc / Store-to-Van / Transfer)</w:t>
-            </w:r>
-          </w:p>
-        </w:tc>
-        <w:tc>
-          <w:tcPr>
-            <w:tcW w:type="dxa" w:w="3079"/>
-          </w:tcPr>
-          <w:p>
-            <w:pPr>
-              <w:spacing w:before="40"/>
-              <w:jc w:val="right"/>
-            </w:pPr>
-            <w:r>
-              <w:rPr>
-                <w:color w:val="CCCCCC"/>
-                <w:sz w:val="16"/>
-              </w:rPr>
-              <w:t>········································</w:t>
-            </w:r>
-          </w:p>
-        </w:tc>
-      </w:tr>
-      <w:tr>
-        <w:tc>
-          <w:tcPr>
-            <w:tcW w:type="dxa" w:w="3079"/>
-          </w:tcPr>
-          <w:p>
-            <w:pPr>
-              <w:spacing w:before="40" w:after="40"/>
-            </w:pPr>
-          </w:p>
-        </w:tc>
-        <w:tc>
-          <w:tcPr>
-            <w:tcW w:type="dxa" w:w="3079"/>
-          </w:tcPr>
-          <w:p>
-            <w:pPr>
-              <w:spacing w:before="40" w:after="40"/>
-              <w:ind w:left="360"/>
-            </w:pPr>
-            <w:r>
-              <w:rPr>
-                <w:b w:val="0"/>
-                <w:color w:val="64748B"/>
-                <w:sz w:val="20"/>
-              </w:rPr>
-              <w:t>4.2  Stock Receipts  (PO / Returns / Misc / Van / Transfer)</w:t>
-            </w:r>
-          </w:p>
-        </w:tc>
-        <w:tc>
-          <w:tcPr>
-            <w:tcW w:type="dxa" w:w="3079"/>
-          </w:tcPr>
-          <w:p>
-            <w:pPr>
-              <w:spacing w:before="40"/>
-              <w:jc w:val="right"/>
-            </w:pPr>
-            <w:r>
-              <w:rPr>
-                <w:color w:val="CCCCCC"/>
-                <w:sz w:val="16"/>
-              </w:rPr>
-              <w:t>········································</w:t>
-            </w:r>
-          </w:p>
-        </w:tc>
-      </w:tr>
-      <w:tr>
-        <w:tc>
-          <w:tcPr>
-            <w:tcW w:type="dxa" w:w="3079"/>
-          </w:tcPr>
-          <w:p>
-            <w:pPr>
-              <w:spacing w:before="40" w:after="40"/>
-            </w:pPr>
-          </w:p>
-        </w:tc>
-        <w:tc>
-          <w:tcPr>
-            <w:tcW w:type="dxa" w:w="3079"/>
-          </w:tcPr>
-          <w:p>
-            <w:pPr>
-              <w:spacing w:before="40" w:after="40"/>
-              <w:ind w:left="360"/>
-            </w:pPr>
-            <w:r>
-              <w:rPr>
-                <w:b w:val="0"/>
-                <w:color w:val="64748B"/>
-                <w:sz w:val="20"/>
-              </w:rPr>
-              <w:t>4.3  Inter-Organisation Transfers  (Bond / Excise / General)</w:t>
-            </w:r>
-          </w:p>
-        </w:tc>
-        <w:tc>
-          <w:tcPr>
-            <w:tcW w:type="dxa" w:w="3079"/>
-          </w:tcPr>
-          <w:p>
-            <w:pPr>
-              <w:spacing w:before="40"/>
-              <w:jc w:val="right"/>
-            </w:pPr>
-            <w:r>
-              <w:rPr>
-                <w:color w:val="CCCCCC"/>
-                <w:sz w:val="16"/>
-              </w:rPr>
-              <w:t>········································</w:t>
-            </w:r>
-          </w:p>
-        </w:tc>
-      </w:tr>
-      <w:tr>
-        <w:tc>
-          <w:tcPr>
-            <w:tcW w:type="dxa" w:w="3079"/>
-          </w:tcPr>
-          <w:p>
-            <w:pPr>
-              <w:spacing w:before="40" w:after="40"/>
-            </w:pPr>
-          </w:p>
-        </w:tc>
-        <w:tc>
-          <w:tcPr>
-            <w:tcW w:type="dxa" w:w="3079"/>
-          </w:tcPr>
-          <w:p>
-            <w:pPr>
-              <w:spacing w:before="40" w:after="40"/>
-              <w:ind w:left="360"/>
-            </w:pPr>
-            <w:r>
-              <w:rPr>
-                <w:b w:val="0"/>
-                <w:color w:val="64748B"/>
-                <w:sz w:val="20"/>
-              </w:rPr>
-              <w:t>4.4  Stock Adjustments</w:t>
-            </w:r>
-          </w:p>
-        </w:tc>
-        <w:tc>
-          <w:tcPr>
-            <w:tcW w:type="dxa" w:w="3079"/>
-          </w:tcPr>
-          <w:p>
-            <w:pPr>
-              <w:spacing w:before="40"/>
-              <w:jc w:val="right"/>
-            </w:pPr>
-            <w:r>
-              <w:rPr>
-                <w:color w:val="CCCCCC"/>
-                <w:sz w:val="16"/>
-              </w:rPr>
-              <w:t>········································</w:t>
-            </w:r>
-          </w:p>
-        </w:tc>
-      </w:tr>
-      <w:tr>
-        <w:tc>
-          <w:tcPr>
-            <w:tcW w:type="dxa" w:w="3079"/>
-          </w:tcPr>
-          <w:p>
-            <w:pPr>
-              <w:spacing w:before="100" w:after="40"/>
+            <w:tcW w:w="720" w:type="dxa"/>
+          </w:tcPr>
+          <w:p>
+            <w:pPr>
+              <w:spacing w:before="80" w:after="80"/>
             </w:pPr>
             <w:r>
               <w:rPr>
@@ -1404,11 +732,11 @@
         <w:tc>
           <w:tcPr>
             <w:tcW w:type="dxa" w:w="3079"/>
-          </w:tcPr>
-          <w:p>
-            <w:pPr>
-              <w:spacing w:before="100" w:after="40"/>
-              <w:ind w:left="0"/>
+            <w:tcW w:w="6480" w:type="dxa"/>
+          </w:tcPr>
+          <w:p>
+            <w:pPr>
+              <w:spacing w:before="80" w:after="80"/>
             </w:pPr>
             <w:r>
               <w:rPr>
@@ -1423,18 +751,19 @@
         <w:tc>
           <w:tcPr>
             <w:tcW w:type="dxa" w:w="3079"/>
-          </w:tcPr>
-          <w:p>
-            <w:pPr>
-              <w:spacing w:before="100"/>
+            <w:tcW w:w="2160" w:type="dxa"/>
+          </w:tcPr>
+          <w:p>
+            <w:pPr>
+              <w:spacing w:before="80" w:after="80"/>
               <w:jc w:val="right"/>
             </w:pPr>
             <w:r>
               <w:rPr>
                 <w:color w:val="CCCCCC"/>
-                <w:sz w:val="16"/>
-              </w:rPr>
-              <w:t>·············································</w:t>
+                <w:sz w:val="18"/>
+              </w:rPr>
+              <w:t>······························</w:t>
             </w:r>
           </w:p>
         </w:tc>
@@ -1443,108 +772,11 @@
         <w:tc>
           <w:tcPr>
             <w:tcW w:type="dxa" w:w="3079"/>
-          </w:tcPr>
-          <w:p>
-            <w:pPr>
-              <w:spacing w:before="40" w:after="40"/>
-            </w:pPr>
-          </w:p>
-        </w:tc>
-        <w:tc>
-          <w:tcPr>
-            <w:tcW w:type="dxa" w:w="3079"/>
-          </w:tcPr>
-          <w:p>
-            <w:pPr>
-              <w:spacing w:before="40" w:after="40"/>
-              <w:ind w:left="360"/>
-            </w:pPr>
-            <w:r>
-              <w:rPr>
-                <w:b w:val="0"/>
-                <w:color w:val="64748B"/>
-                <w:sz w:val="20"/>
-              </w:rPr>
-              <w:t>5.1  Cycle Counting (Fusion-Driven)</w:t>
-            </w:r>
-          </w:p>
-        </w:tc>
-        <w:tc>
-          <w:tcPr>
-            <w:tcW w:type="dxa" w:w="3079"/>
-          </w:tcPr>
-          <w:p>
-            <w:pPr>
-              <w:spacing w:before="40"/>
-              <w:jc w:val="right"/>
-            </w:pPr>
-            <w:r>
-              <w:rPr>
-                <w:color w:val="CCCCCC"/>
-                <w:sz w:val="16"/>
-              </w:rPr>
-              <w:t>········································</w:t>
-            </w:r>
-          </w:p>
-        </w:tc>
-      </w:tr>
-      <w:tr>
-        <w:tc>
-          <w:tcPr>
-            <w:tcW w:type="dxa" w:w="3079"/>
-          </w:tcPr>
-          <w:p>
-            <w:pPr>
-              <w:spacing w:before="40" w:after="40"/>
-            </w:pPr>
-          </w:p>
-        </w:tc>
-        <w:tc>
-          <w:tcPr>
-            <w:tcW w:type="dxa" w:w="3079"/>
-          </w:tcPr>
-          <w:p>
-            <w:pPr>
-              <w:spacing w:before="40" w:after="40"/>
-              <w:ind w:left="360"/>
-            </w:pPr>
-            <w:r>
-              <w:rPr>
-                <w:b w:val="0"/>
-                <w:color w:val="64748B"/>
-                <w:sz w:val="20"/>
-              </w:rPr>
-              <w:t>5.2  Full Physical Inventory Count</w:t>
-            </w:r>
-          </w:p>
-        </w:tc>
-        <w:tc>
-          <w:tcPr>
-            <w:tcW w:type="dxa" w:w="3079"/>
-          </w:tcPr>
-          <w:p>
-            <w:pPr>
-              <w:spacing w:before="40"/>
-              <w:jc w:val="right"/>
-            </w:pPr>
-            <w:r>
-              <w:rPr>
-                <w:color w:val="CCCCCC"/>
-                <w:sz w:val="16"/>
-              </w:rPr>
-              <w:t>········································</w:t>
-            </w:r>
-          </w:p>
-        </w:tc>
-      </w:tr>
-      <w:tr>
-        <w:tc>
-          <w:tcPr>
-            <w:tcW w:type="dxa" w:w="3079"/>
-          </w:tcPr>
-          <w:p>
-            <w:pPr>
-              <w:spacing w:before="100" w:after="40"/>
+            <w:tcW w:w="720" w:type="dxa"/>
+          </w:tcPr>
+          <w:p>
+            <w:pPr>
+              <w:spacing w:before="80" w:after="80"/>
             </w:pPr>
             <w:r>
               <w:rPr>
@@ -1559,11 +791,11 @@
         <w:tc>
           <w:tcPr>
             <w:tcW w:type="dxa" w:w="3079"/>
-          </w:tcPr>
-          <w:p>
-            <w:pPr>
-              <w:spacing w:before="100" w:after="40"/>
-              <w:ind w:left="0"/>
+            <w:tcW w:w="6480" w:type="dxa"/>
+          </w:tcPr>
+          <w:p>
+            <w:pPr>
+              <w:spacing w:before="80" w:after="80"/>
             </w:pPr>
             <w:r>
               <w:rPr>
@@ -1578,18 +810,19 @@
         <w:tc>
           <w:tcPr>
             <w:tcW w:type="dxa" w:w="3079"/>
-          </w:tcPr>
-          <w:p>
-            <w:pPr>
-              <w:spacing w:before="100"/>
+            <w:tcW w:w="2160" w:type="dxa"/>
+          </w:tcPr>
+          <w:p>
+            <w:pPr>
+              <w:spacing w:before="80" w:after="80"/>
               <w:jc w:val="right"/>
             </w:pPr>
             <w:r>
               <w:rPr>
                 <w:color w:val="CCCCCC"/>
-                <w:sz w:val="16"/>
-              </w:rPr>
-              <w:t>·············································</w:t>
+                <w:sz w:val="18"/>
+              </w:rPr>
+              <w:t>······························</w:t>
             </w:r>
           </w:p>
         </w:tc>
@@ -1598,157 +831,11 @@
         <w:tc>
           <w:tcPr>
             <w:tcW w:type="dxa" w:w="3079"/>
-          </w:tcPr>
-          <w:p>
-            <w:pPr>
-              <w:spacing w:before="40" w:after="40"/>
-            </w:pPr>
-          </w:p>
-        </w:tc>
-        <w:tc>
-          <w:tcPr>
-            <w:tcW w:type="dxa" w:w="3079"/>
-          </w:tcPr>
-          <w:p>
-            <w:pPr>
-              <w:spacing w:before="40" w:after="40"/>
-              <w:ind w:left="360"/>
-            </w:pPr>
-            <w:r>
-              <w:rPr>
-                <w:b w:val="0"/>
-                <w:color w:val="64748B"/>
-                <w:sz w:val="20"/>
-              </w:rPr>
-              <w:t>6.1  Putaway Rule Types (Fusion Configuration)</w:t>
-            </w:r>
-          </w:p>
-        </w:tc>
-        <w:tc>
-          <w:tcPr>
-            <w:tcW w:type="dxa" w:w="3079"/>
-          </w:tcPr>
-          <w:p>
-            <w:pPr>
-              <w:spacing w:before="40"/>
-              <w:jc w:val="right"/>
-            </w:pPr>
-            <w:r>
-              <w:rPr>
-                <w:color w:val="CCCCCC"/>
-                <w:sz w:val="16"/>
-              </w:rPr>
-              <w:t>········································</w:t>
-            </w:r>
-          </w:p>
-        </w:tc>
-      </w:tr>
-      <w:tr>
-        <w:tc>
-          <w:tcPr>
-            <w:tcW w:type="dxa" w:w="3079"/>
-          </w:tcPr>
-          <w:p>
-            <w:pPr>
-              <w:spacing w:before="40" w:after="40"/>
-            </w:pPr>
-          </w:p>
-        </w:tc>
-        <w:tc>
-          <w:tcPr>
-            <w:tcW w:type="dxa" w:w="3079"/>
-          </w:tcPr>
-          <w:p>
-            <w:pPr>
-              <w:spacing w:before="40" w:after="40"/>
-              <w:ind w:left="360"/>
-            </w:pPr>
-            <w:r>
-              <w:rPr>
-                <w:b w:val="0"/>
-                <w:color w:val="64748B"/>
-                <w:sz w:val="20"/>
-              </w:rPr>
-              <w:t>6.2  Locator Allocation at Pick Time (FEFO / FIFO)</w:t>
-            </w:r>
-          </w:p>
-        </w:tc>
-        <w:tc>
-          <w:tcPr>
-            <w:tcW w:type="dxa" w:w="3079"/>
-          </w:tcPr>
-          <w:p>
-            <w:pPr>
-              <w:spacing w:before="40"/>
-              <w:jc w:val="right"/>
-            </w:pPr>
-            <w:r>
-              <w:rPr>
-                <w:color w:val="CCCCCC"/>
-                <w:sz w:val="16"/>
-              </w:rPr>
-              <w:t>········································</w:t>
-            </w:r>
-          </w:p>
-        </w:tc>
-      </w:tr>
-      <w:tr>
-        <w:tc>
-          <w:tcPr>
-            <w:tcW w:type="dxa" w:w="3079"/>
-          </w:tcPr>
-          <w:p>
-            <w:pPr>
-              <w:spacing w:before="40" w:after="40"/>
-            </w:pPr>
-          </w:p>
-        </w:tc>
-        <w:tc>
-          <w:tcPr>
-            <w:tcW w:type="dxa" w:w="3079"/>
-          </w:tcPr>
-          <w:p>
-            <w:pPr>
-              <w:spacing w:before="40" w:after="40"/>
-              <w:ind w:left="360"/>
-            </w:pPr>
-            <w:r>
-              <w:rPr>
-                <w:b w:val="0"/>
-                <w:color w:val="64748B"/>
-                <w:sz w:val="20"/>
-              </w:rPr>
-              <w:t>6.3  Replenishment — BULK to PICK</w:t>
-            </w:r>
-          </w:p>
-        </w:tc>
-        <w:tc>
-          <w:tcPr>
-            <w:tcW w:type="dxa" w:w="3079"/>
-          </w:tcPr>
-          <w:p>
-            <w:pPr>
-              <w:spacing w:before="40"/>
-              <w:jc w:val="right"/>
-            </w:pPr>
-            <w:r>
-              <w:rPr>
-                <w:color w:val="CCCCCC"/>
-                <w:sz w:val="16"/>
-              </w:rPr>
-              <w:t>········································</w:t>
-            </w:r>
-          </w:p>
-        </w:tc>
-      </w:tr>
-      <w:tr>
-        <w:tc>
-          <w:tcPr>
-            <w:tcW w:type="dxa" w:w="3079"/>
-          </w:tcPr>
-          <w:p>
-            <w:pPr>
-              <w:spacing w:before="100" w:after="40"/>
+            <w:tcW w:w="720" w:type="dxa"/>
+          </w:tcPr>
+          <w:p>
+            <w:pPr>
+              <w:spacing w:before="80" w:after="80"/>
             </w:pPr>
             <w:r>
               <w:rPr>
@@ -1763,11 +850,11 @@
         <w:tc>
           <w:tcPr>
             <w:tcW w:type="dxa" w:w="3079"/>
-          </w:tcPr>
-          <w:p>
-            <w:pPr>
-              <w:spacing w:before="100" w:after="40"/>
-              <w:ind w:left="0"/>
+            <w:tcW w:w="6480" w:type="dxa"/>
+          </w:tcPr>
+          <w:p>
+            <w:pPr>
+              <w:spacing w:before="80" w:after="80"/>
             </w:pPr>
             <w:r>
               <w:rPr>
@@ -1782,18 +869,19 @@
         <w:tc>
           <w:tcPr>
             <w:tcW w:type="dxa" w:w="3079"/>
-          </w:tcPr>
-          <w:p>
-            <w:pPr>
-              <w:spacing w:before="100"/>
+            <w:tcW w:w="2160" w:type="dxa"/>
+          </w:tcPr>
+          <w:p>
+            <w:pPr>
+              <w:spacing w:before="80" w:after="80"/>
               <w:jc w:val="right"/>
             </w:pPr>
             <w:r>
               <w:rPr>
                 <w:color w:val="CCCCCC"/>
-                <w:sz w:val="16"/>
-              </w:rPr>
-              <w:t>·············································</w:t>
+                <w:sz w:val="18"/>
+              </w:rPr>
+              <w:t>······························</w:t>
             </w:r>
           </w:p>
         </w:tc>
@@ -1802,10 +890,11 @@
         <w:tc>
           <w:tcPr>
             <w:tcW w:type="dxa" w:w="3079"/>
-          </w:tcPr>
-          <w:p>
-            <w:pPr>
-              <w:spacing w:before="100" w:after="40"/>
+            <w:tcW w:w="720" w:type="dxa"/>
+          </w:tcPr>
+          <w:p>
+            <w:pPr>
+              <w:spacing w:before="80" w:after="80"/>
             </w:pPr>
             <w:r>
               <w:rPr>
@@ -1820,11 +909,11 @@
         <w:tc>
           <w:tcPr>
             <w:tcW w:type="dxa" w:w="3079"/>
-          </w:tcPr>
-          <w:p>
-            <w:pPr>
-              <w:spacing w:before="100" w:after="40"/>
-              <w:ind w:left="0"/>
+            <w:tcW w:w="6480" w:type="dxa"/>
+          </w:tcPr>
+          <w:p>
+            <w:pPr>
+              <w:spacing w:before="80" w:after="80"/>
             </w:pPr>
             <w:r>
               <w:rPr>
@@ -1839,18 +928,19 @@
         <w:tc>
           <w:tcPr>
             <w:tcW w:type="dxa" w:w="3079"/>
-          </w:tcPr>
-          <w:p>
-            <w:pPr>
-              <w:spacing w:before="100"/>
+            <w:tcW w:w="2160" w:type="dxa"/>
+          </w:tcPr>
+          <w:p>
+            <w:pPr>
+              <w:spacing w:before="80" w:after="80"/>
               <w:jc w:val="right"/>
             </w:pPr>
             <w:r>
               <w:rPr>
                 <w:color w:val="CCCCCC"/>
-                <w:sz w:val="16"/>
-              </w:rPr>
-              <w:t>·············································</w:t>
+                <w:sz w:val="18"/>
+              </w:rPr>
+              <w:t>······························</w:t>
             </w:r>
           </w:p>
         </w:tc>
@@ -1859,157 +949,11 @@
         <w:tc>
           <w:tcPr>
             <w:tcW w:type="dxa" w:w="3079"/>
-          </w:tcPr>
-          <w:p>
-            <w:pPr>
-              <w:spacing w:before="40" w:after="40"/>
-            </w:pPr>
-          </w:p>
-        </w:tc>
-        <w:tc>
-          <w:tcPr>
-            <w:tcW w:type="dxa" w:w="3079"/>
-          </w:tcPr>
-          <w:p>
-            <w:pPr>
-              <w:spacing w:before="40" w:after="40"/>
-              <w:ind w:left="360"/>
-            </w:pPr>
-            <w:r>
-              <w:rPr>
-                <w:b w:val="0"/>
-                <w:color w:val="64748B"/>
-                <w:sz w:val="20"/>
-              </w:rPr>
-              <w:t>8.1  Locator &amp; Stock Reports</w:t>
-            </w:r>
-          </w:p>
-        </w:tc>
-        <w:tc>
-          <w:tcPr>
-            <w:tcW w:type="dxa" w:w="3079"/>
-          </w:tcPr>
-          <w:p>
-            <w:pPr>
-              <w:spacing w:before="40"/>
-              <w:jc w:val="right"/>
-            </w:pPr>
-            <w:r>
-              <w:rPr>
-                <w:color w:val="CCCCCC"/>
-                <w:sz w:val="16"/>
-              </w:rPr>
-              <w:t>········································</w:t>
-            </w:r>
-          </w:p>
-        </w:tc>
-      </w:tr>
-      <w:tr>
-        <w:tc>
-          <w:tcPr>
-            <w:tcW w:type="dxa" w:w="3079"/>
-          </w:tcPr>
-          <w:p>
-            <w:pPr>
-              <w:spacing w:before="40" w:after="40"/>
-            </w:pPr>
-          </w:p>
-        </w:tc>
-        <w:tc>
-          <w:tcPr>
-            <w:tcW w:type="dxa" w:w="3079"/>
-          </w:tcPr>
-          <w:p>
-            <w:pPr>
-              <w:spacing w:before="40" w:after="40"/>
-              <w:ind w:left="360"/>
-            </w:pPr>
-            <w:r>
-              <w:rPr>
-                <w:b w:val="0"/>
-                <w:color w:val="64748B"/>
-                <w:sz w:val="20"/>
-              </w:rPr>
-              <w:t>8.2  Transaction Reports</w:t>
-            </w:r>
-          </w:p>
-        </w:tc>
-        <w:tc>
-          <w:tcPr>
-            <w:tcW w:type="dxa" w:w="3079"/>
-          </w:tcPr>
-          <w:p>
-            <w:pPr>
-              <w:spacing w:before="40"/>
-              <w:jc w:val="right"/>
-            </w:pPr>
-            <w:r>
-              <w:rPr>
-                <w:color w:val="CCCCCC"/>
-                <w:sz w:val="16"/>
-              </w:rPr>
-              <w:t>········································</w:t>
-            </w:r>
-          </w:p>
-        </w:tc>
-      </w:tr>
-      <w:tr>
-        <w:tc>
-          <w:tcPr>
-            <w:tcW w:type="dxa" w:w="3079"/>
-          </w:tcPr>
-          <w:p>
-            <w:pPr>
-              <w:spacing w:before="40" w:after="40"/>
-            </w:pPr>
-          </w:p>
-        </w:tc>
-        <w:tc>
-          <w:tcPr>
-            <w:tcW w:type="dxa" w:w="3079"/>
-          </w:tcPr>
-          <w:p>
-            <w:pPr>
-              <w:spacing w:before="40" w:after="40"/>
-              <w:ind w:left="360"/>
-            </w:pPr>
-            <w:r>
-              <w:rPr>
-                <w:b w:val="0"/>
-                <w:color w:val="64748B"/>
-                <w:sz w:val="20"/>
-              </w:rPr>
-              <w:t>8.3  KPI Dashboard</w:t>
-            </w:r>
-          </w:p>
-        </w:tc>
-        <w:tc>
-          <w:tcPr>
-            <w:tcW w:type="dxa" w:w="3079"/>
-          </w:tcPr>
-          <w:p>
-            <w:pPr>
-              <w:spacing w:before="40"/>
-              <w:jc w:val="right"/>
-            </w:pPr>
-            <w:r>
-              <w:rPr>
-                <w:color w:val="CCCCCC"/>
-                <w:sz w:val="16"/>
-              </w:rPr>
-              <w:t>········································</w:t>
-            </w:r>
-          </w:p>
-        </w:tc>
-      </w:tr>
-      <w:tr>
-        <w:tc>
-          <w:tcPr>
-            <w:tcW w:type="dxa" w:w="3079"/>
-          </w:tcPr>
-          <w:p>
-            <w:pPr>
-              <w:spacing w:before="100" w:after="40"/>
+            <w:tcW w:w="720" w:type="dxa"/>
+          </w:tcPr>
+          <w:p>
+            <w:pPr>
+              <w:spacing w:before="80" w:after="80"/>
             </w:pPr>
             <w:r>
               <w:rPr>
@@ -2024,11 +968,11 @@
         <w:tc>
           <w:tcPr>
             <w:tcW w:type="dxa" w:w="3079"/>
-          </w:tcPr>
-          <w:p>
-            <w:pPr>
-              <w:spacing w:before="100" w:after="40"/>
-              <w:ind w:left="0"/>
+            <w:tcW w:w="6480" w:type="dxa"/>
+          </w:tcPr>
+          <w:p>
+            <w:pPr>
+              <w:spacing w:before="80" w:after="80"/>
             </w:pPr>
             <w:r>
               <w:rPr>
@@ -2043,18 +987,19 @@
         <w:tc>
           <w:tcPr>
             <w:tcW w:type="dxa" w:w="3079"/>
-          </w:tcPr>
-          <w:p>
-            <w:pPr>
-              <w:spacing w:before="100"/>
+            <w:tcW w:w="2160" w:type="dxa"/>
+          </w:tcPr>
+          <w:p>
+            <w:pPr>
+              <w:spacing w:before="80" w:after="80"/>
               <w:jc w:val="right"/>
             </w:pPr>
             <w:r>
               <w:rPr>
                 <w:color w:val="CCCCCC"/>
-                <w:sz w:val="16"/>
-              </w:rPr>
-              <w:t>·············································</w:t>
+                <w:sz w:val="18"/>
+              </w:rPr>
+              <w:t>······························</w:t>
             </w:r>
           </w:p>
         </w:tc>
@@ -2063,157 +1008,11 @@
         <w:tc>
           <w:tcPr>
             <w:tcW w:type="dxa" w:w="3079"/>
-          </w:tcPr>
-          <w:p>
-            <w:pPr>
-              <w:spacing w:before="40" w:after="40"/>
-            </w:pPr>
-          </w:p>
-        </w:tc>
-        <w:tc>
-          <w:tcPr>
-            <w:tcW w:type="dxa" w:w="3079"/>
-          </w:tcPr>
-          <w:p>
-            <w:pPr>
-              <w:spacing w:before="40" w:after="40"/>
-              <w:ind w:left="360"/>
-            </w:pPr>
-            <w:r>
-              <w:rPr>
-                <w:b w:val="0"/>
-                <w:color w:val="64748B"/>
-                <w:sz w:val="20"/>
-              </w:rPr>
-              <w:t>9.1  Supported Devices</w:t>
-            </w:r>
-          </w:p>
-        </w:tc>
-        <w:tc>
-          <w:tcPr>
-            <w:tcW w:type="dxa" w:w="3079"/>
-          </w:tcPr>
-          <w:p>
-            <w:pPr>
-              <w:spacing w:before="40"/>
-              <w:jc w:val="right"/>
-            </w:pPr>
-            <w:r>
-              <w:rPr>
-                <w:color w:val="CCCCCC"/>
-                <w:sz w:val="16"/>
-              </w:rPr>
-              <w:t>········································</w:t>
-            </w:r>
-          </w:p>
-        </w:tc>
-      </w:tr>
-      <w:tr>
-        <w:tc>
-          <w:tcPr>
-            <w:tcW w:type="dxa" w:w="3079"/>
-          </w:tcPr>
-          <w:p>
-            <w:pPr>
-              <w:spacing w:before="40" w:after="40"/>
-            </w:pPr>
-          </w:p>
-        </w:tc>
-        <w:tc>
-          <w:tcPr>
-            <w:tcW w:type="dxa" w:w="3079"/>
-          </w:tcPr>
-          <w:p>
-            <w:pPr>
-              <w:spacing w:before="40" w:after="40"/>
-              <w:ind w:left="360"/>
-            </w:pPr>
-            <w:r>
-              <w:rPr>
-                <w:b w:val="0"/>
-                <w:color w:val="64748B"/>
-                <w:sz w:val="20"/>
-              </w:rPr>
-              <w:t>9.2  Mobile Transaction Screens</w:t>
-            </w:r>
-          </w:p>
-        </w:tc>
-        <w:tc>
-          <w:tcPr>
-            <w:tcW w:type="dxa" w:w="3079"/>
-          </w:tcPr>
-          <w:p>
-            <w:pPr>
-              <w:spacing w:before="40"/>
-              <w:jc w:val="right"/>
-            </w:pPr>
-            <w:r>
-              <w:rPr>
-                <w:color w:val="CCCCCC"/>
-                <w:sz w:val="16"/>
-              </w:rPr>
-              <w:t>········································</w:t>
-            </w:r>
-          </w:p>
-        </w:tc>
-      </w:tr>
-      <w:tr>
-        <w:tc>
-          <w:tcPr>
-            <w:tcW w:type="dxa" w:w="3079"/>
-          </w:tcPr>
-          <w:p>
-            <w:pPr>
-              <w:spacing w:before="40" w:after="40"/>
-            </w:pPr>
-          </w:p>
-        </w:tc>
-        <w:tc>
-          <w:tcPr>
-            <w:tcW w:type="dxa" w:w="3079"/>
-          </w:tcPr>
-          <w:p>
-            <w:pPr>
-              <w:spacing w:before="40" w:after="40"/>
-              <w:ind w:left="360"/>
-            </w:pPr>
-            <w:r>
-              <w:rPr>
-                <w:b w:val="0"/>
-                <w:color w:val="64748B"/>
-                <w:sz w:val="20"/>
-              </w:rPr>
-              <w:t>9.3  Mobile UX Principles</w:t>
-            </w:r>
-          </w:p>
-        </w:tc>
-        <w:tc>
-          <w:tcPr>
-            <w:tcW w:type="dxa" w:w="3079"/>
-          </w:tcPr>
-          <w:p>
-            <w:pPr>
-              <w:spacing w:before="40"/>
-              <w:jc w:val="right"/>
-            </w:pPr>
-            <w:r>
-              <w:rPr>
-                <w:color w:val="CCCCCC"/>
-                <w:sz w:val="16"/>
-              </w:rPr>
-              <w:t>········································</w:t>
-            </w:r>
-          </w:p>
-        </w:tc>
-      </w:tr>
-      <w:tr>
-        <w:tc>
-          <w:tcPr>
-            <w:tcW w:type="dxa" w:w="3079"/>
-          </w:tcPr>
-          <w:p>
-            <w:pPr>
-              <w:spacing w:before="100" w:after="40"/>
+            <w:tcW w:w="720" w:type="dxa"/>
+          </w:tcPr>
+          <w:p>
+            <w:pPr>
+              <w:spacing w:before="80" w:after="80"/>
             </w:pPr>
             <w:r>
               <w:rPr>
@@ -2228,11 +1027,11 @@
         <w:tc>
           <w:tcPr>
             <w:tcW w:type="dxa" w:w="3079"/>
-          </w:tcPr>
-          <w:p>
-            <w:pPr>
-              <w:spacing w:before="100" w:after="40"/>
-              <w:ind w:left="0"/>
+            <w:tcW w:w="6480" w:type="dxa"/>
+          </w:tcPr>
+          <w:p>
+            <w:pPr>
+              <w:spacing w:before="80" w:after="80"/>
             </w:pPr>
             <w:r>
               <w:rPr>
@@ -2247,18 +1046,19 @@
         <w:tc>
           <w:tcPr>
             <w:tcW w:type="dxa" w:w="3079"/>
-          </w:tcPr>
-          <w:p>
-            <w:pPr>
-              <w:spacing w:before="100"/>
+            <w:tcW w:w="2160" w:type="dxa"/>
+          </w:tcPr>
+          <w:p>
+            <w:pPr>
+              <w:spacing w:before="80" w:after="80"/>
               <w:jc w:val="right"/>
             </w:pPr>
             <w:r>
               <w:rPr>
                 <w:color w:val="CCCCCC"/>
-                <w:sz w:val="16"/>
-              </w:rPr>
-              <w:t>·············································</w:t>
+                <w:sz w:val="18"/>
+              </w:rPr>
+              <w:t>······························</w:t>
             </w:r>
           </w:p>
         </w:tc>
@@ -2267,10 +1067,11 @@
         <w:tc>
           <w:tcPr>
             <w:tcW w:type="dxa" w:w="3079"/>
-          </w:tcPr>
-          <w:p>
-            <w:pPr>
-              <w:spacing w:before="100" w:after="40"/>
+            <w:tcW w:w="720" w:type="dxa"/>
+          </w:tcPr>
+          <w:p>
+            <w:pPr>
+              <w:spacing w:before="80" w:after="80"/>
             </w:pPr>
             <w:r>
               <w:rPr>
@@ -2285,11 +1086,11 @@
         <w:tc>
           <w:tcPr>
             <w:tcW w:type="dxa" w:w="3079"/>
-          </w:tcPr>
-          <w:p>
-            <w:pPr>
-              <w:spacing w:before="100" w:after="40"/>
-              <w:ind w:left="0"/>
+            <w:tcW w:w="6480" w:type="dxa"/>
+          </w:tcPr>
+          <w:p>
+            <w:pPr>
+              <w:spacing w:before="80" w:after="80"/>
             </w:pPr>
             <w:r>
               <w:rPr>
@@ -2304,18 +1105,19 @@
         <w:tc>
           <w:tcPr>
             <w:tcW w:type="dxa" w:w="3079"/>
-          </w:tcPr>
-          <w:p>
-            <w:pPr>
-              <w:spacing w:before="100"/>
+            <w:tcW w:w="2160" w:type="dxa"/>
+          </w:tcPr>
+          <w:p>
+            <w:pPr>
+              <w:spacing w:before="80" w:after="80"/>
               <w:jc w:val="right"/>
             </w:pPr>
             <w:r>
               <w:rPr>
                 <w:color w:val="CCCCCC"/>
-                <w:sz w:val="16"/>
-              </w:rPr>
-              <w:t>·············································</w:t>
+                <w:sz w:val="18"/>
+              </w:rPr>
+              <w:t>······························</w:t>
             </w:r>
           </w:p>
         </w:tc>
@@ -2324,108 +1126,11 @@
         <w:tc>
           <w:tcPr>
             <w:tcW w:type="dxa" w:w="3079"/>
-          </w:tcPr>
-          <w:p>
-            <w:pPr>
-              <w:spacing w:before="40" w:after="40"/>
-            </w:pPr>
-          </w:p>
-        </w:tc>
-        <w:tc>
-          <w:tcPr>
-            <w:tcW w:type="dxa" w:w="3079"/>
-          </w:tcPr>
-          <w:p>
-            <w:pPr>
-              <w:spacing w:before="40" w:after="40"/>
-              <w:ind w:left="360"/>
-            </w:pPr>
-            <w:r>
-              <w:rPr>
-                <w:b w:val="0"/>
-                <w:color w:val="64748B"/>
-                <w:sz w:val="20"/>
-              </w:rPr>
-              <w:t>11.1  Master Data (Fusion → WMS)</w:t>
-            </w:r>
-          </w:p>
-        </w:tc>
-        <w:tc>
-          <w:tcPr>
-            <w:tcW w:type="dxa" w:w="3079"/>
-          </w:tcPr>
-          <w:p>
-            <w:pPr>
-              <w:spacing w:before="40"/>
-              <w:jc w:val="right"/>
-            </w:pPr>
-            <w:r>
-              <w:rPr>
-                <w:color w:val="CCCCCC"/>
-                <w:sz w:val="16"/>
-              </w:rPr>
-              <w:t>········································</w:t>
-            </w:r>
-          </w:p>
-        </w:tc>
-      </w:tr>
-      <w:tr>
-        <w:tc>
-          <w:tcPr>
-            <w:tcW w:type="dxa" w:w="3079"/>
-          </w:tcPr>
-          <w:p>
-            <w:pPr>
-              <w:spacing w:before="40" w:after="40"/>
-            </w:pPr>
-          </w:p>
-        </w:tc>
-        <w:tc>
-          <w:tcPr>
-            <w:tcW w:type="dxa" w:w="3079"/>
-          </w:tcPr>
-          <w:p>
-            <w:pPr>
-              <w:spacing w:before="40" w:after="40"/>
-              <w:ind w:left="360"/>
-            </w:pPr>
-            <w:r>
-              <w:rPr>
-                <w:b w:val="0"/>
-                <w:color w:val="64748B"/>
-                <w:sz w:val="20"/>
-              </w:rPr>
-              <w:t>11.2  Transactions (WMS → Fusion)</w:t>
-            </w:r>
-          </w:p>
-        </w:tc>
-        <w:tc>
-          <w:tcPr>
-            <w:tcW w:type="dxa" w:w="3079"/>
-          </w:tcPr>
-          <w:p>
-            <w:pPr>
-              <w:spacing w:before="40"/>
-              <w:jc w:val="right"/>
-            </w:pPr>
-            <w:r>
-              <w:rPr>
-                <w:color w:val="CCCCCC"/>
-                <w:sz w:val="16"/>
-              </w:rPr>
-              <w:t>········································</w:t>
-            </w:r>
-          </w:p>
-        </w:tc>
-      </w:tr>
-      <w:tr>
-        <w:tc>
-          <w:tcPr>
-            <w:tcW w:type="dxa" w:w="3079"/>
-          </w:tcPr>
-          <w:p>
-            <w:pPr>
-              <w:spacing w:before="100" w:after="40"/>
+            <w:tcW w:w="720" w:type="dxa"/>
+          </w:tcPr>
+          <w:p>
+            <w:pPr>
+              <w:spacing w:before="80" w:after="80"/>
             </w:pPr>
             <w:r>
               <w:rPr>
@@ -2440,11 +1145,11 @@
         <w:tc>
           <w:tcPr>
             <w:tcW w:type="dxa" w:w="3079"/>
-          </w:tcPr>
-          <w:p>
-            <w:pPr>
-              <w:spacing w:before="100" w:after="40"/>
-              <w:ind w:left="0"/>
+            <w:tcW w:w="6480" w:type="dxa"/>
+          </w:tcPr>
+          <w:p>
+            <w:pPr>
+              <w:spacing w:before="80" w:after="80"/>
             </w:pPr>
             <w:r>
               <w:rPr>
@@ -2459,18 +1164,19 @@
         <w:tc>
           <w:tcPr>
             <w:tcW w:type="dxa" w:w="3079"/>
-          </w:tcPr>
-          <w:p>
-            <w:pPr>
-              <w:spacing w:before="100"/>
+            <w:tcW w:w="2160" w:type="dxa"/>
+          </w:tcPr>
+          <w:p>
+            <w:pPr>
+              <w:spacing w:before="80" w:after="80"/>
               <w:jc w:val="right"/>
             </w:pPr>
             <w:r>
               <w:rPr>
                 <w:color w:val="CCCCCC"/>
-                <w:sz w:val="16"/>
-              </w:rPr>
-              <w:t>·············································</w:t>
+                <w:sz w:val="18"/>
+              </w:rPr>
+              <w:t>······························</w:t>
             </w:r>
           </w:p>
         </w:tc>
@@ -2479,157 +1185,11 @@
         <w:tc>
           <w:tcPr>
             <w:tcW w:type="dxa" w:w="3079"/>
-          </w:tcPr>
-          <w:p>
-            <w:pPr>
-              <w:spacing w:before="40" w:after="40"/>
-            </w:pPr>
-          </w:p>
-        </w:tc>
-        <w:tc>
-          <w:tcPr>
-            <w:tcW w:type="dxa" w:w="3079"/>
-          </w:tcPr>
-          <w:p>
-            <w:pPr>
-              <w:spacing w:before="40" w:after="40"/>
-              <w:ind w:left="360"/>
-            </w:pPr>
-            <w:r>
-              <w:rPr>
-                <w:b w:val="0"/>
-                <w:color w:val="64748B"/>
-                <w:sz w:val="20"/>
-              </w:rPr>
-              <w:t>Stream A — Oracle Fusion Setup</w:t>
-            </w:r>
-          </w:p>
-        </w:tc>
-        <w:tc>
-          <w:tcPr>
-            <w:tcW w:type="dxa" w:w="3079"/>
-          </w:tcPr>
-          <w:p>
-            <w:pPr>
-              <w:spacing w:before="40"/>
-              <w:jc w:val="right"/>
-            </w:pPr>
-            <w:r>
-              <w:rPr>
-                <w:color w:val="CCCCCC"/>
-                <w:sz w:val="16"/>
-              </w:rPr>
-              <w:t>········································</w:t>
-            </w:r>
-          </w:p>
-        </w:tc>
-      </w:tr>
-      <w:tr>
-        <w:tc>
-          <w:tcPr>
-            <w:tcW w:type="dxa" w:w="3079"/>
-          </w:tcPr>
-          <w:p>
-            <w:pPr>
-              <w:spacing w:before="40" w:after="40"/>
-            </w:pPr>
-          </w:p>
-        </w:tc>
-        <w:tc>
-          <w:tcPr>
-            <w:tcW w:type="dxa" w:w="3079"/>
-          </w:tcPr>
-          <w:p>
-            <w:pPr>
-              <w:spacing w:before="40" w:after="40"/>
-              <w:ind w:left="360"/>
-            </w:pPr>
-            <w:r>
-              <w:rPr>
-                <w:b w:val="0"/>
-                <w:color w:val="64748B"/>
-                <w:sz w:val="20"/>
-              </w:rPr>
-              <w:t>Stream B — WMS Development</w:t>
-            </w:r>
-          </w:p>
-        </w:tc>
-        <w:tc>
-          <w:tcPr>
-            <w:tcW w:type="dxa" w:w="3079"/>
-          </w:tcPr>
-          <w:p>
-            <w:pPr>
-              <w:spacing w:before="40"/>
-              <w:jc w:val="right"/>
-            </w:pPr>
-            <w:r>
-              <w:rPr>
-                <w:color w:val="CCCCCC"/>
-                <w:sz w:val="16"/>
-              </w:rPr>
-              <w:t>········································</w:t>
-            </w:r>
-          </w:p>
-        </w:tc>
-      </w:tr>
-      <w:tr>
-        <w:tc>
-          <w:tcPr>
-            <w:tcW w:type="dxa" w:w="3079"/>
-          </w:tcPr>
-          <w:p>
-            <w:pPr>
-              <w:spacing w:before="40" w:after="40"/>
-            </w:pPr>
-          </w:p>
-        </w:tc>
-        <w:tc>
-          <w:tcPr>
-            <w:tcW w:type="dxa" w:w="3079"/>
-          </w:tcPr>
-          <w:p>
-            <w:pPr>
-              <w:spacing w:before="40" w:after="40"/>
-              <w:ind w:left="360"/>
-            </w:pPr>
-            <w:r>
-              <w:rPr>
-                <w:b w:val="0"/>
-                <w:color w:val="64748B"/>
-                <w:sz w:val="20"/>
-              </w:rPr>
-              <w:t>Project Gantt (10 months)</w:t>
-            </w:r>
-          </w:p>
-        </w:tc>
-        <w:tc>
-          <w:tcPr>
-            <w:tcW w:type="dxa" w:w="3079"/>
-          </w:tcPr>
-          <w:p>
-            <w:pPr>
-              <w:spacing w:before="40"/>
-              <w:jc w:val="right"/>
-            </w:pPr>
-            <w:r>
-              <w:rPr>
-                <w:color w:val="CCCCCC"/>
-                <w:sz w:val="16"/>
-              </w:rPr>
-              <w:t>········································</w:t>
-            </w:r>
-          </w:p>
-        </w:tc>
-      </w:tr>
-      <w:tr>
-        <w:tc>
-          <w:tcPr>
-            <w:tcW w:type="dxa" w:w="3079"/>
-          </w:tcPr>
-          <w:p>
-            <w:pPr>
-              <w:spacing w:before="100" w:after="40"/>
+            <w:tcW w:w="720" w:type="dxa"/>
+          </w:tcPr>
+          <w:p>
+            <w:pPr>
+              <w:spacing w:before="80" w:after="80"/>
             </w:pPr>
             <w:r>
               <w:rPr>
@@ -2644,11 +1204,11 @@
         <w:tc>
           <w:tcPr>
             <w:tcW w:type="dxa" w:w="3079"/>
-          </w:tcPr>
-          <w:p>
-            <w:pPr>
-              <w:spacing w:before="100" w:after="40"/>
-              <w:ind w:left="0"/>
+            <w:tcW w:w="6480" w:type="dxa"/>
+          </w:tcPr>
+          <w:p>
+            <w:pPr>
+              <w:spacing w:before="80" w:after="80"/>
             </w:pPr>
             <w:r>
               <w:rPr>
@@ -2663,18 +1223,19 @@
         <w:tc>
           <w:tcPr>
             <w:tcW w:type="dxa" w:w="3079"/>
-          </w:tcPr>
-          <w:p>
-            <w:pPr>
-              <w:spacing w:before="100"/>
+            <w:tcW w:w="2160" w:type="dxa"/>
+          </w:tcPr>
+          <w:p>
+            <w:pPr>
+              <w:spacing w:before="80" w:after="80"/>
               <w:jc w:val="right"/>
             </w:pPr>
             <w:r>
               <w:rPr>
                 <w:color w:val="CCCCCC"/>
-                <w:sz w:val="16"/>
-              </w:rPr>
-              <w:t>·············································</w:t>
+                <w:sz w:val="18"/>
+              </w:rPr>
+              <w:t>······························</w:t>
             </w:r>
           </w:p>
         </w:tc>
@@ -2683,157 +1244,11 @@
         <w:tc>
           <w:tcPr>
             <w:tcW w:type="dxa" w:w="3079"/>
-          </w:tcPr>
-          <w:p>
-            <w:pPr>
-              <w:spacing w:before="40" w:after="40"/>
-            </w:pPr>
-          </w:p>
-        </w:tc>
-        <w:tc>
-          <w:tcPr>
-            <w:tcW w:type="dxa" w:w="3079"/>
-          </w:tcPr>
-          <w:p>
-            <w:pPr>
-              <w:spacing w:before="40" w:after="40"/>
-              <w:ind w:left="360"/>
-            </w:pPr>
-            <w:r>
-              <w:rPr>
-                <w:b w:val="0"/>
-                <w:color w:val="64748B"/>
-                <w:sz w:val="20"/>
-              </w:rPr>
-              <w:t>Rate Card</w:t>
-            </w:r>
-          </w:p>
-        </w:tc>
-        <w:tc>
-          <w:tcPr>
-            <w:tcW w:type="dxa" w:w="3079"/>
-          </w:tcPr>
-          <w:p>
-            <w:pPr>
-              <w:spacing w:before="40"/>
-              <w:jc w:val="right"/>
-            </w:pPr>
-            <w:r>
-              <w:rPr>
-                <w:color w:val="CCCCCC"/>
-                <w:sz w:val="16"/>
-              </w:rPr>
-              <w:t>········································</w:t>
-            </w:r>
-          </w:p>
-        </w:tc>
-      </w:tr>
-      <w:tr>
-        <w:tc>
-          <w:tcPr>
-            <w:tcW w:type="dxa" w:w="3079"/>
-          </w:tcPr>
-          <w:p>
-            <w:pPr>
-              <w:spacing w:before="40" w:after="40"/>
-            </w:pPr>
-          </w:p>
-        </w:tc>
-        <w:tc>
-          <w:tcPr>
-            <w:tcW w:type="dxa" w:w="3079"/>
-          </w:tcPr>
-          <w:p>
-            <w:pPr>
-              <w:spacing w:before="40" w:after="40"/>
-              <w:ind w:left="360"/>
-            </w:pPr>
-            <w:r>
-              <w:rPr>
-                <w:b w:val="0"/>
-                <w:color w:val="64748B"/>
-                <w:sz w:val="20"/>
-              </w:rPr>
-              <w:t>Investment Summary</w:t>
-            </w:r>
-          </w:p>
-        </w:tc>
-        <w:tc>
-          <w:tcPr>
-            <w:tcW w:type="dxa" w:w="3079"/>
-          </w:tcPr>
-          <w:p>
-            <w:pPr>
-              <w:spacing w:before="40"/>
-              <w:jc w:val="right"/>
-            </w:pPr>
-            <w:r>
-              <w:rPr>
-                <w:color w:val="CCCCCC"/>
-                <w:sz w:val="16"/>
-              </w:rPr>
-              <w:t>········································</w:t>
-            </w:r>
-          </w:p>
-        </w:tc>
-      </w:tr>
-      <w:tr>
-        <w:tc>
-          <w:tcPr>
-            <w:tcW w:type="dxa" w:w="3079"/>
-          </w:tcPr>
-          <w:p>
-            <w:pPr>
-              <w:spacing w:before="40" w:after="40"/>
-            </w:pPr>
-          </w:p>
-        </w:tc>
-        <w:tc>
-          <w:tcPr>
-            <w:tcW w:type="dxa" w:w="3079"/>
-          </w:tcPr>
-          <w:p>
-            <w:pPr>
-              <w:spacing w:before="40" w:after="40"/>
-              <w:ind w:left="360"/>
-            </w:pPr>
-            <w:r>
-              <w:rPr>
-                <w:b w:val="0"/>
-                <w:color w:val="64748B"/>
-                <w:sz w:val="20"/>
-              </w:rPr>
-              <w:t>Payment Terms</w:t>
-            </w:r>
-          </w:p>
-        </w:tc>
-        <w:tc>
-          <w:tcPr>
-            <w:tcW w:type="dxa" w:w="3079"/>
-          </w:tcPr>
-          <w:p>
-            <w:pPr>
-              <w:spacing w:before="40"/>
-              <w:jc w:val="right"/>
-            </w:pPr>
-            <w:r>
-              <w:rPr>
-                <w:color w:val="CCCCCC"/>
-                <w:sz w:val="16"/>
-              </w:rPr>
-              <w:t>········································</w:t>
-            </w:r>
-          </w:p>
-        </w:tc>
-      </w:tr>
-      <w:tr>
-        <w:tc>
-          <w:tcPr>
-            <w:tcW w:type="dxa" w:w="3079"/>
-          </w:tcPr>
-          <w:p>
-            <w:pPr>
-              <w:spacing w:before="100" w:after="40"/>
+            <w:tcW w:w="720" w:type="dxa"/>
+          </w:tcPr>
+          <w:p>
+            <w:pPr>
+              <w:spacing w:before="80" w:after="80"/>
             </w:pPr>
             <w:r>
               <w:rPr>
@@ -2848,11 +1263,11 @@
         <w:tc>
           <w:tcPr>
             <w:tcW w:type="dxa" w:w="3079"/>
-          </w:tcPr>
-          <w:p>
-            <w:pPr>
-              <w:spacing w:before="100" w:after="40"/>
-              <w:ind w:left="0"/>
+            <w:tcW w:w="6480" w:type="dxa"/>
+          </w:tcPr>
+          <w:p>
+            <w:pPr>
+              <w:spacing w:before="80" w:after="80"/>
             </w:pPr>
             <w:r>
               <w:rPr>
@@ -2867,18 +1282,19 @@
         <w:tc>
           <w:tcPr>
             <w:tcW w:type="dxa" w:w="3079"/>
-          </w:tcPr>
-          <w:p>
-            <w:pPr>
-              <w:spacing w:before="100"/>
+            <w:tcW w:w="2160" w:type="dxa"/>
+          </w:tcPr>
+          <w:p>
+            <w:pPr>
+              <w:spacing w:before="80" w:after="80"/>
               <w:jc w:val="right"/>
             </w:pPr>
             <w:r>
               <w:rPr>
                 <w:color w:val="CCCCCC"/>
-                <w:sz w:val="16"/>
-              </w:rPr>
-              <w:t>·············································</w:t>
+                <w:sz w:val="18"/>
+              </w:rPr>
+              <w:t>······························</w:t>
             </w:r>
           </w:p>
         </w:tc>
@@ -2887,10 +1303,11 @@
         <w:tc>
           <w:tcPr>
             <w:tcW w:type="dxa" w:w="3079"/>
-          </w:tcPr>
-          <w:p>
-            <w:pPr>
-              <w:spacing w:before="100" w:after="40"/>
+            <w:tcW w:w="720" w:type="dxa"/>
+          </w:tcPr>
+          <w:p>
+            <w:pPr>
+              <w:spacing w:before="80" w:after="80"/>
             </w:pPr>
             <w:r>
               <w:rPr>
@@ -2905,11 +1322,11 @@
         <w:tc>
           <w:tcPr>
             <w:tcW w:type="dxa" w:w="3079"/>
-          </w:tcPr>
-          <w:p>
-            <w:pPr>
-              <w:spacing w:before="100" w:after="40"/>
-              <w:ind w:left="0"/>
+            <w:tcW w:w="6480" w:type="dxa"/>
+          </w:tcPr>
+          <w:p>
+            <w:pPr>
+              <w:spacing w:before="80" w:after="80"/>
             </w:pPr>
             <w:r>
               <w:rPr>
@@ -2924,18 +1341,19 @@
         <w:tc>
           <w:tcPr>
             <w:tcW w:type="dxa" w:w="3079"/>
-          </w:tcPr>
-          <w:p>
-            <w:pPr>
-              <w:spacing w:before="100"/>
+            <w:tcW w:w="2160" w:type="dxa"/>
+          </w:tcPr>
+          <w:p>
+            <w:pPr>
+              <w:spacing w:before="80" w:after="80"/>
               <w:jc w:val="right"/>
             </w:pPr>
             <w:r>
               <w:rPr>
                 <w:color w:val="CCCCCC"/>
-                <w:sz w:val="16"/>
-              </w:rPr>
-              <w:t>·············································</w:t>
+                <w:sz w:val="18"/>
+              </w:rPr>
+              <w:t>······························</w:t>
             </w:r>
           </w:p>
         </w:tc>

</xml_diff>